<commit_message>
Day 38 v3: Manuscript corrections from pending items resolution
- Hardware: corrected to AMD Ryzen 9 3900X, 24 threads, 64 GB RAM, Ubuntu Linux
- Extreme heat: added definition (Tmax > 35C, absolute threshold, BR-DWGD)
- SHACL: all 5 shapes described completely including LowBirthWeightShape
</commit_message>
<xml_diff>
--- a/docs/manuscript/manuscript_perinatalkg_v2.docx
+++ b/docs/manuscript/manuscript_perinatalkg_v2.docx
@@ -464,7 +464,7 @@
           <w:rFonts w:ascii="Times New Roman" w:hAnsi="Times New Roman"/>
           <w:sz w:val="24"/>
         </w:rPr>
-        <w:t>Apache Jena Fuseki 6.0.0 [15] on commodity hardware (24-core CPU, 32 GB RAM). Ontology consistency verified with owlrl OWL RL reasoner. SHACL validation enforced clinical constraints on five node shapes (birth weight 200–7,000g; gestational age 20–45 weeks; Apgar 0–10).</w:t>
+        <w:t>Apache Jena Fuseki 6.0.0 [15] on commodity hardware (AMD Ryzen 9 3900X, 24 threads, 64 GB RAM, Ubuntu Linux). Ontology consistency verified with owlrl OWL RL reasoner. SHACL validation enforced clinical constraints on five node shapes: birth weight (200–7,000 g), gestational age (20–45 weeks), maternal age (10–60 years), prenatal visits (0–42), and clinical consistency rules requiring PretermBirth instances to have gestational age &lt; 37 weeks and LowBirthWeight instances to have birth weight &lt; 2,500 g.</w:t>
       </w:r>
     </w:p>
     <w:p>
@@ -595,7 +595,7 @@
           <w:rFonts w:ascii="Times New Roman" w:hAnsi="Times New Roman"/>
           <w:sz w:val="24"/>
         </w:rPr>
-        <w:t>Preterm birth rate: 10.8% (101,287/934,807). Low birth weight: 8.9% (83,660). Extreme heat exposure T3: 41.4% (387,012). Mean birth weight: 3,141g. These statistics are directly derivable from the SPARQL endpoint.</w:t>
+        <w:t>Preterm birth rate: 10.8% (101,287/934,807). Low birth weight: 8.9% (83,660). Extreme heat exposure T3: 41.4% (387,012), defined as at least one day with maximum daily temperature exceeding 35°C during the third trimester (BR-DWGD gridded data, absolute threshold applied uniformly across municipalities). Mean birth weight: 3,141 g. These statistics are directly derivable from the SPARQL endpoint.</w:t>
       </w:r>
     </w:p>
     <w:p>

</xml_diff>